<commit_message>
Actualizar textos de la portada de la ficha
Co-Authored-By: Claude Sonnet 5.5 <noreply@anthropic.com>
Claude-Session: https://claude.ai/code/session_01KNBEGzGoBFbZah4ZJLT3vf
</commit_message>
<xml_diff>
--- a/docs/ficha/Ficha_Producto_CATMetrix_ES.docx
+++ b/docs/ficha/Ficha_Producto_CATMetrix_ES.docx
@@ -96,7 +96,7 @@
                 <w:color w:val="FFFFFF"/>
                 <w:sz w:val="60"/>
               </w:rPr>
-              <w:t>Un programa municipal que se puede demostrar.</w:t>
+              <w:t>Una gestión responsable empieza con el control.</w:t>
             </w:r>
           </w:p>
           <w:p>
@@ -109,7 +109,7 @@
                 <w:color w:val="FFFFFF"/>
                 <w:sz w:val="22"/>
               </w:rPr>
-              <w:t>Censo, fichas clínicas, control CER e incidencias en una sola plataforma</w:t>
+              <w:t>Censo, seguimiento CER, incidencias e indicadores en una única plataforma.</w:t>
             </w:r>
           </w:p>
           <w:p>
@@ -122,7 +122,7 @@
                 <w:color w:val="FFFFFF"/>
                 <w:sz w:val="24"/>
               </w:rPr>
-              <w:t>LISTO PARA HOY.</w:t>
+              <w:t>Más control sobre la gestión. Más visibilidad sobre los resultados.</w:t>
             </w:r>
           </w:p>
           <w:p>

</xml_diff>